<commit_message>
Ejemplos de HTML 9 a 12
</commit_message>
<xml_diff>
--- a/PC3-ADSII-LPVT-p1.docx
+++ b/PC3-ADSII-LPVT-p1.docx
@@ -69,6 +69,7 @@
       </w:pPr>
       <w:r>
         <w:rPr>
+          <w:noProof/>
           <w:lang w:val="es-MX"/>
         </w:rPr>
         <w:drawing>
@@ -109,6 +110,7 @@
       </w:r>
       <w:r>
         <w:rPr>
+          <w:noProof/>
           <w:lang w:val="es-MX"/>
         </w:rPr>
         <w:drawing>
@@ -169,6 +171,7 @@
       </w:pPr>
       <w:r>
         <w:rPr>
+          <w:noProof/>
           <w:lang w:val="es-MX"/>
         </w:rPr>
         <w:lastRenderedPageBreak/>
@@ -217,6 +220,7 @@
       </w:pPr>
       <w:r>
         <w:rPr>
+          <w:noProof/>
           <w:lang w:val="es-MX"/>
         </w:rPr>
         <w:drawing>
@@ -277,6 +281,7 @@
       </w:pPr>
       <w:r>
         <w:rPr>
+          <w:noProof/>
           <w:lang w:val="es-MX"/>
         </w:rPr>
         <w:lastRenderedPageBreak/>
@@ -325,6 +330,7 @@
       </w:pPr>
       <w:r>
         <w:rPr>
+          <w:noProof/>
           <w:lang w:val="es-MX"/>
         </w:rPr>
         <w:drawing>
@@ -385,6 +391,7 @@
       </w:pPr>
       <w:r>
         <w:rPr>
+          <w:noProof/>
           <w:lang w:val="es-MX"/>
         </w:rPr>
         <w:lastRenderedPageBreak/>
@@ -433,6 +440,7 @@
       </w:pPr>
       <w:r>
         <w:rPr>
+          <w:noProof/>
           <w:lang w:val="es-MX"/>
         </w:rPr>
         <w:lastRenderedPageBreak/>
@@ -494,6 +502,7 @@
       </w:pPr>
       <w:r>
         <w:rPr>
+          <w:noProof/>
           <w:lang w:val="es-MX"/>
         </w:rPr>
         <w:drawing>
@@ -541,6 +550,7 @@
       </w:pPr>
       <w:r>
         <w:rPr>
+          <w:noProof/>
           <w:lang w:val="es-MX"/>
         </w:rPr>
         <w:lastRenderedPageBreak/>
@@ -608,6 +618,7 @@
       </w:r>
       <w:r>
         <w:rPr>
+          <w:noProof/>
           <w:lang w:val="es-MX"/>
         </w:rPr>
         <w:drawing>
@@ -655,6 +666,7 @@
       </w:pPr>
       <w:r>
         <w:rPr>
+          <w:noProof/>
           <w:lang w:val="es-MX"/>
         </w:rPr>
         <w:lastRenderedPageBreak/>
@@ -703,6 +715,7 @@
       </w:pPr>
       <w:r>
         <w:rPr>
+          <w:noProof/>
           <w:lang w:val="es-MX"/>
         </w:rPr>
         <w:drawing>
@@ -750,6 +763,7 @@
       </w:pPr>
       <w:r>
         <w:rPr>
+          <w:noProof/>
           <w:lang w:val="es-MX"/>
         </w:rPr>
         <w:drawing>
@@ -797,6 +811,7 @@
       </w:pPr>
       <w:r>
         <w:rPr>
+          <w:noProof/>
           <w:lang w:val="es-MX"/>
         </w:rPr>
         <w:lastRenderedPageBreak/>
@@ -845,6 +860,7 @@
       </w:pPr>
       <w:r>
         <w:rPr>
+          <w:noProof/>
           <w:lang w:val="es-MX"/>
         </w:rPr>
         <w:drawing>
@@ -905,6 +921,7 @@
       </w:pPr>
       <w:r>
         <w:rPr>
+          <w:noProof/>
           <w:lang w:val="es-MX"/>
         </w:rPr>
         <w:drawing>
@@ -952,6 +969,7 @@
       </w:pPr>
       <w:r>
         <w:rPr>
+          <w:noProof/>
           <w:lang w:val="es-MX"/>
         </w:rPr>
         <w:lastRenderedPageBreak/>
@@ -1000,6 +1018,7 @@
       </w:pPr>
       <w:r>
         <w:rPr>
+          <w:noProof/>
           <w:lang w:val="es-MX"/>
         </w:rPr>
         <w:drawing>
@@ -1047,6 +1066,7 @@
       </w:pPr>
       <w:r>
         <w:rPr>
+          <w:noProof/>
           <w:lang w:val="es-MX"/>
         </w:rPr>
         <w:drawing>
@@ -1107,6 +1127,7 @@
       </w:pPr>
       <w:r>
         <w:rPr>
+          <w:noProof/>
           <w:lang w:val="es-MX"/>
         </w:rPr>
         <w:lastRenderedPageBreak/>
@@ -1155,6 +1176,7 @@
       </w:pPr>
       <w:r>
         <w:rPr>
+          <w:noProof/>
           <w:lang w:val="es-MX"/>
         </w:rPr>
         <w:drawing>
@@ -1193,6 +1215,759 @@
           </wp:inline>
         </w:drawing>
       </w:r>
+    </w:p>
+    <w:p>
+      <w:pPr>
+        <w:rPr>
+          <w:lang w:val="es-MX"/>
+        </w:rPr>
+      </w:pPr>
+      <w:r>
+        <w:rPr>
+          <w:lang w:val="es-MX"/>
+        </w:rPr>
+        <w:t>9.</w:t>
+      </w:r>
+    </w:p>
+    <w:p>
+      <w:pPr>
+        <w:rPr>
+          <w:lang w:val="es-MX"/>
+        </w:rPr>
+      </w:pPr>
+      <w:r>
+        <w:rPr>
+          <w:lang w:val="es-MX"/>
+        </w:rPr>
+        <w:lastRenderedPageBreak/>
+        <w:drawing>
+          <wp:inline distT="0" distB="0" distL="0" distR="0" wp14:anchorId="51DAA6A1" wp14:editId="34E50EA8">
+            <wp:extent cx="6858000" cy="5897245"/>
+            <wp:effectExtent l="0" t="0" r="0" b="8255"/>
+            <wp:docPr id="2072219097" name="Imagen 1"/>
+            <wp:cNvGraphicFramePr>
+              <a:graphicFrameLocks xmlns:a="http://schemas.openxmlformats.org/drawingml/2006/main" noChangeAspect="1"/>
+            </wp:cNvGraphicFramePr>
+            <a:graphic xmlns:a="http://schemas.openxmlformats.org/drawingml/2006/main">
+              <a:graphicData uri="http://schemas.openxmlformats.org/drawingml/2006/picture">
+                <pic:pic xmlns:pic="http://schemas.openxmlformats.org/drawingml/2006/picture">
+                  <pic:nvPicPr>
+                    <pic:cNvPr id="2072219097" name=""/>
+                    <pic:cNvPicPr/>
+                  </pic:nvPicPr>
+                  <pic:blipFill>
+                    <a:blip r:embed="rId26"/>
+                    <a:stretch>
+                      <a:fillRect/>
+                    </a:stretch>
+                  </pic:blipFill>
+                  <pic:spPr>
+                    <a:xfrm>
+                      <a:off x="0" y="0"/>
+                      <a:ext cx="6858000" cy="5897245"/>
+                    </a:xfrm>
+                    <a:prstGeom prst="rect">
+                      <a:avLst/>
+                    </a:prstGeom>
+                  </pic:spPr>
+                </pic:pic>
+              </a:graphicData>
+            </a:graphic>
+          </wp:inline>
+        </w:drawing>
+      </w:r>
+    </w:p>
+    <w:p>
+      <w:pPr>
+        <w:rPr>
+          <w:lang w:val="es-MX"/>
+        </w:rPr>
+      </w:pPr>
+      <w:r>
+        <w:rPr>
+          <w:lang w:val="es-MX"/>
+        </w:rPr>
+        <w:lastRenderedPageBreak/>
+        <w:drawing>
+          <wp:inline distT="0" distB="0" distL="0" distR="0" wp14:anchorId="643F02AC" wp14:editId="2F5CE45D">
+            <wp:extent cx="6858000" cy="5614035"/>
+            <wp:effectExtent l="0" t="0" r="0" b="5715"/>
+            <wp:docPr id="2126988284" name="Imagen 1"/>
+            <wp:cNvGraphicFramePr>
+              <a:graphicFrameLocks xmlns:a="http://schemas.openxmlformats.org/drawingml/2006/main" noChangeAspect="1"/>
+            </wp:cNvGraphicFramePr>
+            <a:graphic xmlns:a="http://schemas.openxmlformats.org/drawingml/2006/main">
+              <a:graphicData uri="http://schemas.openxmlformats.org/drawingml/2006/picture">
+                <pic:pic xmlns:pic="http://schemas.openxmlformats.org/drawingml/2006/picture">
+                  <pic:nvPicPr>
+                    <pic:cNvPr id="2126988284" name=""/>
+                    <pic:cNvPicPr/>
+                  </pic:nvPicPr>
+                  <pic:blipFill>
+                    <a:blip r:embed="rId27"/>
+                    <a:stretch>
+                      <a:fillRect/>
+                    </a:stretch>
+                  </pic:blipFill>
+                  <pic:spPr>
+                    <a:xfrm>
+                      <a:off x="0" y="0"/>
+                      <a:ext cx="6858000" cy="5614035"/>
+                    </a:xfrm>
+                    <a:prstGeom prst="rect">
+                      <a:avLst/>
+                    </a:prstGeom>
+                  </pic:spPr>
+                </pic:pic>
+              </a:graphicData>
+            </a:graphic>
+          </wp:inline>
+        </w:drawing>
+      </w:r>
+    </w:p>
+    <w:p>
+      <w:pPr>
+        <w:rPr>
+          <w:lang w:val="es-MX"/>
+        </w:rPr>
+      </w:pPr>
+      <w:r>
+        <w:rPr>
+          <w:lang w:val="es-MX"/>
+        </w:rPr>
+        <w:lastRenderedPageBreak/>
+        <w:drawing>
+          <wp:inline distT="0" distB="0" distL="0" distR="0" wp14:anchorId="18776006" wp14:editId="69029ACF">
+            <wp:extent cx="6858000" cy="5677535"/>
+            <wp:effectExtent l="0" t="0" r="0" b="0"/>
+            <wp:docPr id="960185680" name="Imagen 1"/>
+            <wp:cNvGraphicFramePr>
+              <a:graphicFrameLocks xmlns:a="http://schemas.openxmlformats.org/drawingml/2006/main" noChangeAspect="1"/>
+            </wp:cNvGraphicFramePr>
+            <a:graphic xmlns:a="http://schemas.openxmlformats.org/drawingml/2006/main">
+              <a:graphicData uri="http://schemas.openxmlformats.org/drawingml/2006/picture">
+                <pic:pic xmlns:pic="http://schemas.openxmlformats.org/drawingml/2006/picture">
+                  <pic:nvPicPr>
+                    <pic:cNvPr id="960185680" name=""/>
+                    <pic:cNvPicPr/>
+                  </pic:nvPicPr>
+                  <pic:blipFill>
+                    <a:blip r:embed="rId28"/>
+                    <a:stretch>
+                      <a:fillRect/>
+                    </a:stretch>
+                  </pic:blipFill>
+                  <pic:spPr>
+                    <a:xfrm>
+                      <a:off x="0" y="0"/>
+                      <a:ext cx="6858000" cy="5677535"/>
+                    </a:xfrm>
+                    <a:prstGeom prst="rect">
+                      <a:avLst/>
+                    </a:prstGeom>
+                  </pic:spPr>
+                </pic:pic>
+              </a:graphicData>
+            </a:graphic>
+          </wp:inline>
+        </w:drawing>
+      </w:r>
+    </w:p>
+    <w:p>
+      <w:pPr>
+        <w:rPr>
+          <w:lang w:val="es-MX"/>
+        </w:rPr>
+      </w:pPr>
+      <w:r>
+        <w:rPr>
+          <w:lang w:val="es-MX"/>
+        </w:rPr>
+        <w:lastRenderedPageBreak/>
+        <w:drawing>
+          <wp:inline distT="0" distB="0" distL="0" distR="0" wp14:anchorId="43DD055C" wp14:editId="580D3660">
+            <wp:extent cx="6858000" cy="3512820"/>
+            <wp:effectExtent l="0" t="0" r="0" b="0"/>
+            <wp:docPr id="85095850" name="Imagen 1"/>
+            <wp:cNvGraphicFramePr>
+              <a:graphicFrameLocks xmlns:a="http://schemas.openxmlformats.org/drawingml/2006/main" noChangeAspect="1"/>
+            </wp:cNvGraphicFramePr>
+            <a:graphic xmlns:a="http://schemas.openxmlformats.org/drawingml/2006/main">
+              <a:graphicData uri="http://schemas.openxmlformats.org/drawingml/2006/picture">
+                <pic:pic xmlns:pic="http://schemas.openxmlformats.org/drawingml/2006/picture">
+                  <pic:nvPicPr>
+                    <pic:cNvPr id="85095850" name=""/>
+                    <pic:cNvPicPr/>
+                  </pic:nvPicPr>
+                  <pic:blipFill>
+                    <a:blip r:embed="rId29"/>
+                    <a:stretch>
+                      <a:fillRect/>
+                    </a:stretch>
+                  </pic:blipFill>
+                  <pic:spPr>
+                    <a:xfrm>
+                      <a:off x="0" y="0"/>
+                      <a:ext cx="6858000" cy="3512820"/>
+                    </a:xfrm>
+                    <a:prstGeom prst="rect">
+                      <a:avLst/>
+                    </a:prstGeom>
+                  </pic:spPr>
+                </pic:pic>
+              </a:graphicData>
+            </a:graphic>
+          </wp:inline>
+        </w:drawing>
+      </w:r>
+    </w:p>
+    <w:p>
+      <w:pPr>
+        <w:rPr>
+          <w:lang w:val="es-MX"/>
+        </w:rPr>
+      </w:pPr>
+      <w:r>
+        <w:rPr>
+          <w:lang w:val="es-MX"/>
+        </w:rPr>
+        <w:drawing>
+          <wp:inline distT="0" distB="0" distL="0" distR="0" wp14:anchorId="6FBC2633" wp14:editId="7BBF464E">
+            <wp:extent cx="6858000" cy="1925955"/>
+            <wp:effectExtent l="0" t="0" r="0" b="0"/>
+            <wp:docPr id="1350920176" name="Imagen 1"/>
+            <wp:cNvGraphicFramePr>
+              <a:graphicFrameLocks xmlns:a="http://schemas.openxmlformats.org/drawingml/2006/main" noChangeAspect="1"/>
+            </wp:cNvGraphicFramePr>
+            <a:graphic xmlns:a="http://schemas.openxmlformats.org/drawingml/2006/main">
+              <a:graphicData uri="http://schemas.openxmlformats.org/drawingml/2006/picture">
+                <pic:pic xmlns:pic="http://schemas.openxmlformats.org/drawingml/2006/picture">
+                  <pic:nvPicPr>
+                    <pic:cNvPr id="1350920176" name=""/>
+                    <pic:cNvPicPr/>
+                  </pic:nvPicPr>
+                  <pic:blipFill>
+                    <a:blip r:embed="rId30"/>
+                    <a:stretch>
+                      <a:fillRect/>
+                    </a:stretch>
+                  </pic:blipFill>
+                  <pic:spPr>
+                    <a:xfrm>
+                      <a:off x="0" y="0"/>
+                      <a:ext cx="6858000" cy="1925955"/>
+                    </a:xfrm>
+                    <a:prstGeom prst="rect">
+                      <a:avLst/>
+                    </a:prstGeom>
+                  </pic:spPr>
+                </pic:pic>
+              </a:graphicData>
+            </a:graphic>
+          </wp:inline>
+        </w:drawing>
+      </w:r>
+      <w:r>
+        <w:rPr>
+          <w:lang w:val="es-MX"/>
+        </w:rPr>
+        <w:drawing>
+          <wp:inline distT="0" distB="0" distL="0" distR="0" wp14:anchorId="645560F7" wp14:editId="2CD899DD">
+            <wp:extent cx="6858000" cy="929005"/>
+            <wp:effectExtent l="0" t="0" r="0" b="4445"/>
+            <wp:docPr id="1388465594" name="Imagen 1"/>
+            <wp:cNvGraphicFramePr>
+              <a:graphicFrameLocks xmlns:a="http://schemas.openxmlformats.org/drawingml/2006/main" noChangeAspect="1"/>
+            </wp:cNvGraphicFramePr>
+            <a:graphic xmlns:a="http://schemas.openxmlformats.org/drawingml/2006/main">
+              <a:graphicData uri="http://schemas.openxmlformats.org/drawingml/2006/picture">
+                <pic:pic xmlns:pic="http://schemas.openxmlformats.org/drawingml/2006/picture">
+                  <pic:nvPicPr>
+                    <pic:cNvPr id="1388465594" name=""/>
+                    <pic:cNvPicPr/>
+                  </pic:nvPicPr>
+                  <pic:blipFill>
+                    <a:blip r:embed="rId31"/>
+                    <a:stretch>
+                      <a:fillRect/>
+                    </a:stretch>
+                  </pic:blipFill>
+                  <pic:spPr>
+                    <a:xfrm>
+                      <a:off x="0" y="0"/>
+                      <a:ext cx="6858000" cy="929005"/>
+                    </a:xfrm>
+                    <a:prstGeom prst="rect">
+                      <a:avLst/>
+                    </a:prstGeom>
+                  </pic:spPr>
+                </pic:pic>
+              </a:graphicData>
+            </a:graphic>
+          </wp:inline>
+        </w:drawing>
+      </w:r>
+    </w:p>
+    <w:p>
+      <w:pPr>
+        <w:rPr>
+          <w:lang w:val="es-MX"/>
+        </w:rPr>
+      </w:pPr>
+      <w:r>
+        <w:rPr>
+          <w:lang w:val="es-MX"/>
+        </w:rPr>
+        <w:t>10.</w:t>
+      </w:r>
+    </w:p>
+    <w:p>
+      <w:pPr>
+        <w:rPr>
+          <w:lang w:val="es-MX"/>
+        </w:rPr>
+      </w:pPr>
+      <w:r>
+        <w:rPr>
+          <w:lang w:val="es-MX"/>
+        </w:rPr>
+        <w:lastRenderedPageBreak/>
+        <w:drawing>
+          <wp:inline distT="0" distB="0" distL="0" distR="0" wp14:anchorId="63CB6A9A" wp14:editId="7ED5BB5F">
+            <wp:extent cx="6858000" cy="5539105"/>
+            <wp:effectExtent l="0" t="0" r="0" b="4445"/>
+            <wp:docPr id="1712148285" name="Imagen 1"/>
+            <wp:cNvGraphicFramePr>
+              <a:graphicFrameLocks xmlns:a="http://schemas.openxmlformats.org/drawingml/2006/main" noChangeAspect="1"/>
+            </wp:cNvGraphicFramePr>
+            <a:graphic xmlns:a="http://schemas.openxmlformats.org/drawingml/2006/main">
+              <a:graphicData uri="http://schemas.openxmlformats.org/drawingml/2006/picture">
+                <pic:pic xmlns:pic="http://schemas.openxmlformats.org/drawingml/2006/picture">
+                  <pic:nvPicPr>
+                    <pic:cNvPr id="1712148285" name=""/>
+                    <pic:cNvPicPr/>
+                  </pic:nvPicPr>
+                  <pic:blipFill>
+                    <a:blip r:embed="rId32"/>
+                    <a:stretch>
+                      <a:fillRect/>
+                    </a:stretch>
+                  </pic:blipFill>
+                  <pic:spPr>
+                    <a:xfrm>
+                      <a:off x="0" y="0"/>
+                      <a:ext cx="6858000" cy="5539105"/>
+                    </a:xfrm>
+                    <a:prstGeom prst="rect">
+                      <a:avLst/>
+                    </a:prstGeom>
+                  </pic:spPr>
+                </pic:pic>
+              </a:graphicData>
+            </a:graphic>
+          </wp:inline>
+        </w:drawing>
+      </w:r>
+    </w:p>
+    <w:p>
+      <w:pPr>
+        <w:rPr>
+          <w:lang w:val="es-MX"/>
+        </w:rPr>
+      </w:pPr>
+      <w:r>
+        <w:rPr>
+          <w:lang w:val="es-MX"/>
+        </w:rPr>
+        <w:drawing>
+          <wp:inline distT="0" distB="0" distL="0" distR="0" wp14:anchorId="4E176AE3" wp14:editId="736C542A">
+            <wp:extent cx="5363323" cy="2772162"/>
+            <wp:effectExtent l="0" t="0" r="0" b="9525"/>
+            <wp:docPr id="1085406681" name="Imagen 1"/>
+            <wp:cNvGraphicFramePr>
+              <a:graphicFrameLocks xmlns:a="http://schemas.openxmlformats.org/drawingml/2006/main" noChangeAspect="1"/>
+            </wp:cNvGraphicFramePr>
+            <a:graphic xmlns:a="http://schemas.openxmlformats.org/drawingml/2006/main">
+              <a:graphicData uri="http://schemas.openxmlformats.org/drawingml/2006/picture">
+                <pic:pic xmlns:pic="http://schemas.openxmlformats.org/drawingml/2006/picture">
+                  <pic:nvPicPr>
+                    <pic:cNvPr id="1085406681" name=""/>
+                    <pic:cNvPicPr/>
+                  </pic:nvPicPr>
+                  <pic:blipFill>
+                    <a:blip r:embed="rId33"/>
+                    <a:stretch>
+                      <a:fillRect/>
+                    </a:stretch>
+                  </pic:blipFill>
+                  <pic:spPr>
+                    <a:xfrm>
+                      <a:off x="0" y="0"/>
+                      <a:ext cx="5363323" cy="2772162"/>
+                    </a:xfrm>
+                    <a:prstGeom prst="rect">
+                      <a:avLst/>
+                    </a:prstGeom>
+                  </pic:spPr>
+                </pic:pic>
+              </a:graphicData>
+            </a:graphic>
+          </wp:inline>
+        </w:drawing>
+      </w:r>
+    </w:p>
+    <w:p>
+      <w:pPr>
+        <w:rPr>
+          <w:lang w:val="es-MX"/>
+        </w:rPr>
+      </w:pPr>
+      <w:r>
+        <w:rPr>
+          <w:lang w:val="es-MX"/>
+        </w:rPr>
+        <w:t>11.</w:t>
+      </w:r>
+    </w:p>
+    <w:p>
+      <w:pPr>
+        <w:rPr>
+          <w:lang w:val="es-MX"/>
+        </w:rPr>
+      </w:pPr>
+      <w:r>
+        <w:rPr>
+          <w:lang w:val="es-MX"/>
+        </w:rPr>
+        <w:lastRenderedPageBreak/>
+        <w:drawing>
+          <wp:inline distT="0" distB="0" distL="0" distR="0" wp14:anchorId="68A5D984" wp14:editId="3D9682EE">
+            <wp:extent cx="6620799" cy="7144747"/>
+            <wp:effectExtent l="0" t="0" r="8890" b="0"/>
+            <wp:docPr id="539558360" name="Imagen 1"/>
+            <wp:cNvGraphicFramePr>
+              <a:graphicFrameLocks xmlns:a="http://schemas.openxmlformats.org/drawingml/2006/main" noChangeAspect="1"/>
+            </wp:cNvGraphicFramePr>
+            <a:graphic xmlns:a="http://schemas.openxmlformats.org/drawingml/2006/main">
+              <a:graphicData uri="http://schemas.openxmlformats.org/drawingml/2006/picture">
+                <pic:pic xmlns:pic="http://schemas.openxmlformats.org/drawingml/2006/picture">
+                  <pic:nvPicPr>
+                    <pic:cNvPr id="539558360" name=""/>
+                    <pic:cNvPicPr/>
+                  </pic:nvPicPr>
+                  <pic:blipFill>
+                    <a:blip r:embed="rId34"/>
+                    <a:stretch>
+                      <a:fillRect/>
+                    </a:stretch>
+                  </pic:blipFill>
+                  <pic:spPr>
+                    <a:xfrm>
+                      <a:off x="0" y="0"/>
+                      <a:ext cx="6620799" cy="7144747"/>
+                    </a:xfrm>
+                    <a:prstGeom prst="rect">
+                      <a:avLst/>
+                    </a:prstGeom>
+                  </pic:spPr>
+                </pic:pic>
+              </a:graphicData>
+            </a:graphic>
+          </wp:inline>
+        </w:drawing>
+      </w:r>
+    </w:p>
+    <w:p>
+      <w:pPr>
+        <w:rPr>
+          <w:lang w:val="es-MX"/>
+        </w:rPr>
+      </w:pPr>
+      <w:r>
+        <w:rPr>
+          <w:lang w:val="es-MX"/>
+        </w:rPr>
+        <w:lastRenderedPageBreak/>
+        <w:drawing>
+          <wp:inline distT="0" distB="0" distL="0" distR="0" wp14:anchorId="6F9B2C74" wp14:editId="4925E7D8">
+            <wp:extent cx="6858000" cy="2179955"/>
+            <wp:effectExtent l="0" t="0" r="0" b="0"/>
+            <wp:docPr id="307633687" name="Imagen 1"/>
+            <wp:cNvGraphicFramePr>
+              <a:graphicFrameLocks xmlns:a="http://schemas.openxmlformats.org/drawingml/2006/main" noChangeAspect="1"/>
+            </wp:cNvGraphicFramePr>
+            <a:graphic xmlns:a="http://schemas.openxmlformats.org/drawingml/2006/main">
+              <a:graphicData uri="http://schemas.openxmlformats.org/drawingml/2006/picture">
+                <pic:pic xmlns:pic="http://schemas.openxmlformats.org/drawingml/2006/picture">
+                  <pic:nvPicPr>
+                    <pic:cNvPr id="307633687" name=""/>
+                    <pic:cNvPicPr/>
+                  </pic:nvPicPr>
+                  <pic:blipFill>
+                    <a:blip r:embed="rId35"/>
+                    <a:stretch>
+                      <a:fillRect/>
+                    </a:stretch>
+                  </pic:blipFill>
+                  <pic:spPr>
+                    <a:xfrm>
+                      <a:off x="0" y="0"/>
+                      <a:ext cx="6858000" cy="2179955"/>
+                    </a:xfrm>
+                    <a:prstGeom prst="rect">
+                      <a:avLst/>
+                    </a:prstGeom>
+                  </pic:spPr>
+                </pic:pic>
+              </a:graphicData>
+            </a:graphic>
+          </wp:inline>
+        </w:drawing>
+      </w:r>
+    </w:p>
+    <w:p>
+      <w:pPr>
+        <w:rPr>
+          <w:lang w:val="es-MX"/>
+        </w:rPr>
+      </w:pPr>
+      <w:r>
+        <w:rPr>
+          <w:lang w:val="es-MX"/>
+        </w:rPr>
+        <w:t>12.</w:t>
+      </w:r>
+    </w:p>
+    <w:p>
+      <w:pPr>
+        <w:rPr>
+          <w:lang w:val="es-MX"/>
+        </w:rPr>
+      </w:pPr>
+      <w:r>
+        <w:rPr>
+          <w:lang w:val="es-MX"/>
+        </w:rPr>
+        <w:drawing>
+          <wp:inline distT="0" distB="0" distL="0" distR="0" wp14:anchorId="024FC223" wp14:editId="26A771D0">
+            <wp:extent cx="6858000" cy="5255260"/>
+            <wp:effectExtent l="0" t="0" r="0" b="2540"/>
+            <wp:docPr id="405223767" name="Imagen 1"/>
+            <wp:cNvGraphicFramePr>
+              <a:graphicFrameLocks xmlns:a="http://schemas.openxmlformats.org/drawingml/2006/main" noChangeAspect="1"/>
+            </wp:cNvGraphicFramePr>
+            <a:graphic xmlns:a="http://schemas.openxmlformats.org/drawingml/2006/main">
+              <a:graphicData uri="http://schemas.openxmlformats.org/drawingml/2006/picture">
+                <pic:pic xmlns:pic="http://schemas.openxmlformats.org/drawingml/2006/picture">
+                  <pic:nvPicPr>
+                    <pic:cNvPr id="405223767" name=""/>
+                    <pic:cNvPicPr/>
+                  </pic:nvPicPr>
+                  <pic:blipFill>
+                    <a:blip r:embed="rId36"/>
+                    <a:stretch>
+                      <a:fillRect/>
+                    </a:stretch>
+                  </pic:blipFill>
+                  <pic:spPr>
+                    <a:xfrm>
+                      <a:off x="0" y="0"/>
+                      <a:ext cx="6858000" cy="5255260"/>
+                    </a:xfrm>
+                    <a:prstGeom prst="rect">
+                      <a:avLst/>
+                    </a:prstGeom>
+                  </pic:spPr>
+                </pic:pic>
+              </a:graphicData>
+            </a:graphic>
+          </wp:inline>
+        </w:drawing>
+      </w:r>
+    </w:p>
+    <w:p>
+      <w:pPr>
+        <w:rPr>
+          <w:lang w:val="es-MX"/>
+        </w:rPr>
+      </w:pPr>
+      <w:r>
+        <w:rPr>
+          <w:lang w:val="es-MX"/>
+        </w:rPr>
+        <w:lastRenderedPageBreak/>
+        <w:drawing>
+          <wp:inline distT="0" distB="0" distL="0" distR="0" wp14:anchorId="28125438" wp14:editId="0D408A3E">
+            <wp:extent cx="6858000" cy="5798185"/>
+            <wp:effectExtent l="0" t="0" r="0" b="0"/>
+            <wp:docPr id="1470378123" name="Imagen 1"/>
+            <wp:cNvGraphicFramePr>
+              <a:graphicFrameLocks xmlns:a="http://schemas.openxmlformats.org/drawingml/2006/main" noChangeAspect="1"/>
+            </wp:cNvGraphicFramePr>
+            <a:graphic xmlns:a="http://schemas.openxmlformats.org/drawingml/2006/main">
+              <a:graphicData uri="http://schemas.openxmlformats.org/drawingml/2006/picture">
+                <pic:pic xmlns:pic="http://schemas.openxmlformats.org/drawingml/2006/picture">
+                  <pic:nvPicPr>
+                    <pic:cNvPr id="1470378123" name=""/>
+                    <pic:cNvPicPr/>
+                  </pic:nvPicPr>
+                  <pic:blipFill>
+                    <a:blip r:embed="rId37"/>
+                    <a:stretch>
+                      <a:fillRect/>
+                    </a:stretch>
+                  </pic:blipFill>
+                  <pic:spPr>
+                    <a:xfrm>
+                      <a:off x="0" y="0"/>
+                      <a:ext cx="6858000" cy="5798185"/>
+                    </a:xfrm>
+                    <a:prstGeom prst="rect">
+                      <a:avLst/>
+                    </a:prstGeom>
+                  </pic:spPr>
+                </pic:pic>
+              </a:graphicData>
+            </a:graphic>
+          </wp:inline>
+        </w:drawing>
+      </w:r>
+      <w:r>
+        <w:rPr>
+          <w:lang w:val="es-MX"/>
+        </w:rPr>
+        <w:lastRenderedPageBreak/>
+        <w:drawing>
+          <wp:inline distT="0" distB="0" distL="0" distR="0" wp14:anchorId="14BEB3FA" wp14:editId="4EF0F592">
+            <wp:extent cx="6858000" cy="6671945"/>
+            <wp:effectExtent l="0" t="0" r="0" b="0"/>
+            <wp:docPr id="220132375" name="Imagen 1"/>
+            <wp:cNvGraphicFramePr>
+              <a:graphicFrameLocks xmlns:a="http://schemas.openxmlformats.org/drawingml/2006/main" noChangeAspect="1"/>
+            </wp:cNvGraphicFramePr>
+            <a:graphic xmlns:a="http://schemas.openxmlformats.org/drawingml/2006/main">
+              <a:graphicData uri="http://schemas.openxmlformats.org/drawingml/2006/picture">
+                <pic:pic xmlns:pic="http://schemas.openxmlformats.org/drawingml/2006/picture">
+                  <pic:nvPicPr>
+                    <pic:cNvPr id="220132375" name=""/>
+                    <pic:cNvPicPr/>
+                  </pic:nvPicPr>
+                  <pic:blipFill>
+                    <a:blip r:embed="rId38"/>
+                    <a:stretch>
+                      <a:fillRect/>
+                    </a:stretch>
+                  </pic:blipFill>
+                  <pic:spPr>
+                    <a:xfrm>
+                      <a:off x="0" y="0"/>
+                      <a:ext cx="6858000" cy="6671945"/>
+                    </a:xfrm>
+                    <a:prstGeom prst="rect">
+                      <a:avLst/>
+                    </a:prstGeom>
+                  </pic:spPr>
+                </pic:pic>
+              </a:graphicData>
+            </a:graphic>
+          </wp:inline>
+        </w:drawing>
+      </w:r>
+      <w:r>
+        <w:rPr>
+          <w:lang w:val="es-MX"/>
+        </w:rPr>
+        <w:drawing>
+          <wp:inline distT="0" distB="0" distL="0" distR="0" wp14:anchorId="2D8026C8" wp14:editId="285C9FAC">
+            <wp:extent cx="4229690" cy="2191056"/>
+            <wp:effectExtent l="0" t="0" r="0" b="0"/>
+            <wp:docPr id="1138019311" name="Imagen 1"/>
+            <wp:cNvGraphicFramePr>
+              <a:graphicFrameLocks xmlns:a="http://schemas.openxmlformats.org/drawingml/2006/main" noChangeAspect="1"/>
+            </wp:cNvGraphicFramePr>
+            <a:graphic xmlns:a="http://schemas.openxmlformats.org/drawingml/2006/main">
+              <a:graphicData uri="http://schemas.openxmlformats.org/drawingml/2006/picture">
+                <pic:pic xmlns:pic="http://schemas.openxmlformats.org/drawingml/2006/picture">
+                  <pic:nvPicPr>
+                    <pic:cNvPr id="1138019311" name=""/>
+                    <pic:cNvPicPr/>
+                  </pic:nvPicPr>
+                  <pic:blipFill>
+                    <a:blip r:embed="rId39"/>
+                    <a:stretch>
+                      <a:fillRect/>
+                    </a:stretch>
+                  </pic:blipFill>
+                  <pic:spPr>
+                    <a:xfrm>
+                      <a:off x="0" y="0"/>
+                      <a:ext cx="4229690" cy="2191056"/>
+                    </a:xfrm>
+                    <a:prstGeom prst="rect">
+                      <a:avLst/>
+                    </a:prstGeom>
+                  </pic:spPr>
+                </pic:pic>
+              </a:graphicData>
+            </a:graphic>
+          </wp:inline>
+        </w:drawing>
+      </w:r>
+    </w:p>
+    <w:p>
+      <w:pPr>
+        <w:rPr>
+          <w:lang w:val="es-MX"/>
+        </w:rPr>
+      </w:pPr>
+      <w:r>
+        <w:rPr>
+          <w:lang w:val="es-MX"/>
+        </w:rPr>
+        <w:lastRenderedPageBreak/>
+        <w:drawing>
+          <wp:inline distT="0" distB="0" distL="0" distR="0" wp14:anchorId="5A7A5EE5" wp14:editId="6CC9B2BD">
+            <wp:extent cx="6858000" cy="2983865"/>
+            <wp:effectExtent l="0" t="0" r="0" b="6985"/>
+            <wp:docPr id="29126704" name="Imagen 1"/>
+            <wp:cNvGraphicFramePr>
+              <a:graphicFrameLocks xmlns:a="http://schemas.openxmlformats.org/drawingml/2006/main" noChangeAspect="1"/>
+            </wp:cNvGraphicFramePr>
+            <a:graphic xmlns:a="http://schemas.openxmlformats.org/drawingml/2006/main">
+              <a:graphicData uri="http://schemas.openxmlformats.org/drawingml/2006/picture">
+                <pic:pic xmlns:pic="http://schemas.openxmlformats.org/drawingml/2006/picture">
+                  <pic:nvPicPr>
+                    <pic:cNvPr id="29126704" name=""/>
+                    <pic:cNvPicPr/>
+                  </pic:nvPicPr>
+                  <pic:blipFill>
+                    <a:blip r:embed="rId40"/>
+                    <a:stretch>
+                      <a:fillRect/>
+                    </a:stretch>
+                  </pic:blipFill>
+                  <pic:spPr>
+                    <a:xfrm>
+                      <a:off x="0" y="0"/>
+                      <a:ext cx="6858000" cy="2983865"/>
+                    </a:xfrm>
+                    <a:prstGeom prst="rect">
+                      <a:avLst/>
+                    </a:prstGeom>
+                  </pic:spPr>
+                </pic:pic>
+              </a:graphicData>
+            </a:graphic>
+          </wp:inline>
+        </w:drawing>
+      </w:r>
+    </w:p>
+    <w:p>
+      <w:pPr>
+        <w:rPr>
+          <w:lang w:val="es-MX"/>
+        </w:rPr>
+      </w:pPr>
     </w:p>
     <w:sectPr>
       <w:pgSz w:w="12240" w:h="15840"/>

</xml_diff>